<commit_message>
Initial commit - Contact Management System
</commit_message>
<xml_diff>
--- a/Files For Contact Mannagnmnet System.docx
+++ b/Files For Contact Mannagnmnet System.docx
@@ -17,6 +17,9 @@
     </w:p>
     <w:p>
       <w:r>
+        <w:rPr>
+          <w:noProof/>
+        </w:rPr>
         <w:drawing>
           <wp:inline distT="0" distB="0" distL="0" distR="0" wp14:anchorId="28CE5F6C" wp14:editId="1BAB91AA">
             <wp:extent cx="5731510" cy="3792070"/>
@@ -56,6 +59,9 @@
     </w:p>
     <w:p>
       <w:r>
+        <w:rPr>
+          <w:noProof/>
+        </w:rPr>
         <w:drawing>
           <wp:inline distT="0" distB="0" distL="0" distR="0" wp14:anchorId="13008156" wp14:editId="581802A0">
             <wp:extent cx="5731510" cy="3832412"/>
@@ -95,6 +101,9 @@
     </w:p>
     <w:p>
       <w:r>
+        <w:rPr>
+          <w:noProof/>
+        </w:rPr>
         <w:lastRenderedPageBreak/>
         <w:drawing>
           <wp:inline distT="0" distB="0" distL="0" distR="0" wp14:anchorId="180EBFDF" wp14:editId="156A58BB">
@@ -135,6 +144,9 @@
     </w:p>
     <w:p>
       <w:r>
+        <w:rPr>
+          <w:noProof/>
+        </w:rPr>
         <w:drawing>
           <wp:inline distT="0" distB="0" distL="0" distR="0" wp14:anchorId="749194B1" wp14:editId="7A607CFC">
             <wp:extent cx="5731510" cy="3156857"/>
@@ -174,6 +186,9 @@
     </w:p>
     <w:p>
       <w:r>
+        <w:rPr>
+          <w:noProof/>
+        </w:rPr>
         <w:lastRenderedPageBreak/>
         <w:drawing>
           <wp:inline distT="0" distB="0" distL="0" distR="0" wp14:anchorId="003129BD" wp14:editId="791ADCF9">
@@ -214,6 +229,9 @@
     </w:p>
     <w:p>
       <w:r>
+        <w:rPr>
+          <w:noProof/>
+        </w:rPr>
         <w:drawing>
           <wp:inline distT="0" distB="0" distL="0" distR="0" wp14:anchorId="23EDE63A" wp14:editId="09DF3A82">
             <wp:extent cx="5731510" cy="4136390"/>
@@ -251,6 +269,46 @@
         </w:drawing>
       </w:r>
     </w:p>
+    <w:p>
+      <w:r>
+        <w:lastRenderedPageBreak/>
+        <w:drawing>
+          <wp:inline distT="0" distB="0" distL="0" distR="0" wp14:anchorId="4FDD8576" wp14:editId="25AF0A71">
+            <wp:extent cx="5731510" cy="4275455"/>
+            <wp:effectExtent l="0" t="0" r="0" b="4445"/>
+            <wp:docPr id="52083725" name="Picture 1"/>
+            <wp:cNvGraphicFramePr>
+              <a:graphicFrameLocks xmlns:a="http://schemas.openxmlformats.org/drawingml/2006/main" noChangeAspect="1"/>
+            </wp:cNvGraphicFramePr>
+            <a:graphic xmlns:a="http://schemas.openxmlformats.org/drawingml/2006/main">
+              <a:graphicData uri="http://schemas.openxmlformats.org/drawingml/2006/picture">
+                <pic:pic xmlns:pic="http://schemas.openxmlformats.org/drawingml/2006/picture">
+                  <pic:nvPicPr>
+                    <pic:cNvPr id="52083725" name=""/>
+                    <pic:cNvPicPr/>
+                  </pic:nvPicPr>
+                  <pic:blipFill>
+                    <a:blip r:embed="rId12"/>
+                    <a:stretch>
+                      <a:fillRect/>
+                    </a:stretch>
+                  </pic:blipFill>
+                  <pic:spPr>
+                    <a:xfrm>
+                      <a:off x="0" y="0"/>
+                      <a:ext cx="5731510" cy="4275455"/>
+                    </a:xfrm>
+                    <a:prstGeom prst="rect">
+                      <a:avLst/>
+                    </a:prstGeom>
+                  </pic:spPr>
+                </pic:pic>
+              </a:graphicData>
+            </a:graphic>
+          </wp:inline>
+        </w:drawing>
+      </w:r>
+    </w:p>
     <w:p/>
     <w:p/>
     <w:p>
@@ -258,7 +316,6 @@
         <w:pStyle w:val="Heading1"/>
       </w:pPr>
       <w:r>
-        <w:lastRenderedPageBreak/>
         <w:t xml:space="preserve">VS </w:t>
       </w:r>
       <w:proofErr w:type="gramStart"/>
@@ -270,6 +327,9 @@
     <w:p/>
     <w:p>
       <w:r>
+        <w:rPr>
+          <w:noProof/>
+        </w:rPr>
         <w:drawing>
           <wp:inline distT="0" distB="0" distL="0" distR="0" wp14:anchorId="289A765E" wp14:editId="52262750">
             <wp:extent cx="5731510" cy="2111188"/>
@@ -286,7 +346,7 @@
                     <pic:cNvPicPr/>
                   </pic:nvPicPr>
                   <pic:blipFill>
-                    <a:blip r:embed="rId12"/>
+                    <a:blip r:embed="rId13"/>
                     <a:stretch>
                       <a:fillRect/>
                     </a:stretch>
@@ -309,6 +369,10 @@
     </w:p>
     <w:p>
       <w:r>
+        <w:rPr>
+          <w:noProof/>
+        </w:rPr>
+        <w:lastRenderedPageBreak/>
         <w:drawing>
           <wp:inline distT="0" distB="0" distL="0" distR="0" wp14:anchorId="68AC2D48" wp14:editId="067D8892">
             <wp:extent cx="5731510" cy="2853690"/>
@@ -325,7 +389,7 @@
                     <pic:cNvPicPr/>
                   </pic:nvPicPr>
                   <pic:blipFill>
-                    <a:blip r:embed="rId13"/>
+                    <a:blip r:embed="rId14"/>
                     <a:stretch>
                       <a:fillRect/>
                     </a:stretch>
@@ -373,11 +437,12 @@
     </w:p>
     <w:p>
       <w:r>
+        <w:lastRenderedPageBreak/>
         <w:drawing>
-          <wp:inline distT="0" distB="0" distL="0" distR="0" wp14:anchorId="5EAC36D7" wp14:editId="0B076ADE">
-            <wp:extent cx="4794250" cy="8216153"/>
-            <wp:effectExtent l="0" t="0" r="0" b="1270"/>
-            <wp:docPr id="1237232160" name="Picture 1"/>
+          <wp:inline distT="0" distB="0" distL="0" distR="0" wp14:anchorId="60C23196" wp14:editId="14F53005">
+            <wp:extent cx="3870325" cy="8863330"/>
+            <wp:effectExtent l="0" t="0" r="3175" b="1270"/>
+            <wp:docPr id="968984669" name="Picture 1"/>
             <wp:cNvGraphicFramePr>
               <a:graphicFrameLocks xmlns:a="http://schemas.openxmlformats.org/drawingml/2006/main" noChangeAspect="1"/>
             </wp:cNvGraphicFramePr>
@@ -385,55 +450,7 @@
               <a:graphicData uri="http://schemas.openxmlformats.org/drawingml/2006/picture">
                 <pic:pic xmlns:pic="http://schemas.openxmlformats.org/drawingml/2006/picture">
                   <pic:nvPicPr>
-                    <pic:cNvPr id="1237232160" name=""/>
-                    <pic:cNvPicPr/>
-                  </pic:nvPicPr>
-                  <pic:blipFill>
-                    <a:blip r:embed="rId14"/>
-                    <a:stretch>
-                      <a:fillRect/>
-                    </a:stretch>
-                  </pic:blipFill>
-                  <pic:spPr>
-                    <a:xfrm>
-                      <a:off x="0" y="0"/>
-                      <a:ext cx="4877120" cy="8358172"/>
-                    </a:xfrm>
-                    <a:prstGeom prst="rect">
-                      <a:avLst/>
-                    </a:prstGeom>
-                  </pic:spPr>
-                </pic:pic>
-              </a:graphicData>
-            </a:graphic>
-          </wp:inline>
-        </w:drawing>
-      </w:r>
-    </w:p>
-    <w:p>
-      <w:pPr>
-        <w:pStyle w:val="Heading1"/>
-      </w:pPr>
-      <w:r>
-        <w:lastRenderedPageBreak/>
-        <w:t>Front End:</w:t>
-      </w:r>
-    </w:p>
-    <w:p>
-      <w:r>
-        <w:drawing>
-          <wp:inline distT="0" distB="0" distL="0" distR="0" wp14:anchorId="1CB3637D" wp14:editId="7430BF13">
-            <wp:extent cx="4839970" cy="8425543"/>
-            <wp:effectExtent l="0" t="0" r="0" b="0"/>
-            <wp:docPr id="1749574779" name="Picture 1"/>
-            <wp:cNvGraphicFramePr>
-              <a:graphicFrameLocks xmlns:a="http://schemas.openxmlformats.org/drawingml/2006/main" noChangeAspect="1"/>
-            </wp:cNvGraphicFramePr>
-            <a:graphic xmlns:a="http://schemas.openxmlformats.org/drawingml/2006/main">
-              <a:graphicData uri="http://schemas.openxmlformats.org/drawingml/2006/picture">
-                <pic:pic xmlns:pic="http://schemas.openxmlformats.org/drawingml/2006/picture">
-                  <pic:nvPicPr>
-                    <pic:cNvPr id="1749574779" name=""/>
+                    <pic:cNvPr id="968984669" name=""/>
                     <pic:cNvPicPr/>
                   </pic:nvPicPr>
                   <pic:blipFill>
@@ -445,7 +462,135 @@
                   <pic:spPr>
                     <a:xfrm>
                       <a:off x="0" y="0"/>
-                      <a:ext cx="4883564" cy="8501433"/>
+                      <a:ext cx="3870325" cy="8863330"/>
+                    </a:xfrm>
+                    <a:prstGeom prst="rect">
+                      <a:avLst/>
+                    </a:prstGeom>
+                  </pic:spPr>
+                </pic:pic>
+              </a:graphicData>
+            </a:graphic>
+          </wp:inline>
+        </w:drawing>
+      </w:r>
+    </w:p>
+    <w:p>
+      <w:pPr>
+        <w:pStyle w:val="Heading1"/>
+      </w:pPr>
+      <w:r>
+        <w:lastRenderedPageBreak/>
+        <w:t>Front End:</w:t>
+      </w:r>
+    </w:p>
+    <w:p>
+      <w:r>
+        <w:lastRenderedPageBreak/>
+        <w:drawing>
+          <wp:inline distT="0" distB="0" distL="0" distR="0" wp14:anchorId="11AD9D10" wp14:editId="4C6F3120">
+            <wp:extent cx="2902585" cy="8863330"/>
+            <wp:effectExtent l="0" t="0" r="5715" b="1270"/>
+            <wp:docPr id="2050562779" name="Picture 1"/>
+            <wp:cNvGraphicFramePr>
+              <a:graphicFrameLocks xmlns:a="http://schemas.openxmlformats.org/drawingml/2006/main" noChangeAspect="1"/>
+            </wp:cNvGraphicFramePr>
+            <a:graphic xmlns:a="http://schemas.openxmlformats.org/drawingml/2006/main">
+              <a:graphicData uri="http://schemas.openxmlformats.org/drawingml/2006/picture">
+                <pic:pic xmlns:pic="http://schemas.openxmlformats.org/drawingml/2006/picture">
+                  <pic:nvPicPr>
+                    <pic:cNvPr id="2050562779" name=""/>
+                    <pic:cNvPicPr/>
+                  </pic:nvPicPr>
+                  <pic:blipFill>
+                    <a:blip r:embed="rId16"/>
+                    <a:stretch>
+                      <a:fillRect/>
+                    </a:stretch>
+                  </pic:blipFill>
+                  <pic:spPr>
+                    <a:xfrm>
+                      <a:off x="0" y="0"/>
+                      <a:ext cx="2902585" cy="8863330"/>
+                    </a:xfrm>
+                    <a:prstGeom prst="rect">
+                      <a:avLst/>
+                    </a:prstGeom>
+                  </pic:spPr>
+                </pic:pic>
+              </a:graphicData>
+            </a:graphic>
+          </wp:inline>
+        </w:drawing>
+      </w:r>
+    </w:p>
+    <w:p>
+      <w:r>
+        <w:lastRenderedPageBreak/>
+        <w:drawing>
+          <wp:inline distT="0" distB="0" distL="0" distR="0" wp14:anchorId="5100FC49" wp14:editId="6327F175">
+            <wp:extent cx="5731510" cy="3592830"/>
+            <wp:effectExtent l="0" t="0" r="0" b="1270"/>
+            <wp:docPr id="1555391047" name="Picture 1"/>
+            <wp:cNvGraphicFramePr>
+              <a:graphicFrameLocks xmlns:a="http://schemas.openxmlformats.org/drawingml/2006/main" noChangeAspect="1"/>
+            </wp:cNvGraphicFramePr>
+            <a:graphic xmlns:a="http://schemas.openxmlformats.org/drawingml/2006/main">
+              <a:graphicData uri="http://schemas.openxmlformats.org/drawingml/2006/picture">
+                <pic:pic xmlns:pic="http://schemas.openxmlformats.org/drawingml/2006/picture">
+                  <pic:nvPicPr>
+                    <pic:cNvPr id="1555391047" name=""/>
+                    <pic:cNvPicPr/>
+                  </pic:nvPicPr>
+                  <pic:blipFill>
+                    <a:blip r:embed="rId17"/>
+                    <a:stretch>
+                      <a:fillRect/>
+                    </a:stretch>
+                  </pic:blipFill>
+                  <pic:spPr>
+                    <a:xfrm>
+                      <a:off x="0" y="0"/>
+                      <a:ext cx="5731510" cy="3592830"/>
+                    </a:xfrm>
+                    <a:prstGeom prst="rect">
+                      <a:avLst/>
+                    </a:prstGeom>
+                  </pic:spPr>
+                </pic:pic>
+              </a:graphicData>
+            </a:graphic>
+          </wp:inline>
+        </w:drawing>
+      </w:r>
+    </w:p>
+    <w:p>
+      <w:r>
+        <w:drawing>
+          <wp:inline distT="0" distB="0" distL="0" distR="0" wp14:anchorId="28D58AE6" wp14:editId="114904D2">
+            <wp:extent cx="5731510" cy="3244215"/>
+            <wp:effectExtent l="0" t="0" r="0" b="0"/>
+            <wp:docPr id="1079668184" name="Picture 1"/>
+            <wp:cNvGraphicFramePr>
+              <a:graphicFrameLocks xmlns:a="http://schemas.openxmlformats.org/drawingml/2006/main" noChangeAspect="1"/>
+            </wp:cNvGraphicFramePr>
+            <a:graphic xmlns:a="http://schemas.openxmlformats.org/drawingml/2006/main">
+              <a:graphicData uri="http://schemas.openxmlformats.org/drawingml/2006/picture">
+                <pic:pic xmlns:pic="http://schemas.openxmlformats.org/drawingml/2006/picture">
+                  <pic:nvPicPr>
+                    <pic:cNvPr id="1079668184" name=""/>
+                    <pic:cNvPicPr/>
+                  </pic:nvPicPr>
+                  <pic:blipFill>
+                    <a:blip r:embed="rId18"/>
+                    <a:stretch>
+                      <a:fillRect/>
+                    </a:stretch>
+                  </pic:blipFill>
+                  <pic:spPr>
+                    <a:xfrm>
+                      <a:off x="0" y="0"/>
+                      <a:ext cx="5731510" cy="3244215"/>
                     </a:xfrm>
                     <a:prstGeom prst="rect">
                       <a:avLst/>

</xml_diff>